<commit_message>
made tools.py efficient, cleaned garbage files
</commit_message>
<xml_diff>
--- a/Tools.docx
+++ b/Tools.docx
@@ -6937,7 +6937,7 @@
     <w:p>
       <w:r>
         <w:pict w14:anchorId="3F491F62">
-          <v:rect id="_x0000_i1051" style="width:564pt;height:.75pt" o:hrpct="0" o:hralign="center" o:hrstd="t" o:hr="t" fillcolor="#a0a0a0" stroked="f"/>
+          <v:rect id="_x0000_i1045" style="width:564pt;height:.75pt" o:hrpct="0" o:hralign="center" o:hrstd="t" o:hr="t" fillcolor="#a0a0a0" stroked="f"/>
         </w:pict>
       </w:r>
     </w:p>
@@ -7369,6 +7369,8 @@
         <w:t> A) form cyclic components that are cleanly solved by global graph algorithms like Strongly Connected Components (SCC).</w:t>
       </w:r>
     </w:p>
+    <w:p/>
+    <w:p/>
     <w:p/>
     <w:sectPr>
       <w:pgSz w:w="12240" w:h="15840"/>
@@ -11939,6 +11941,7 @@
   <w:style w:type="character" w:default="1" w:styleId="DefaultParagraphFont">
     <w:name w:val="Default Paragraph Font"/>
     <w:uiPriority w:val="1"/>
+    <w:semiHidden/>
     <w:unhideWhenUsed/>
   </w:style>
   <w:style w:type="table" w:default="1" w:styleId="TableNormal">

</xml_diff>